<commit_message>
feat: update multiple annex documents for data protection compliance
</commit_message>
<xml_diff>
--- a/02_NORMAS/I02-L-CA Annex de Protecció de Dades - Contracte laboral.docx
+++ b/02_NORMAS/I02-L-CA Annex de Protecció de Dades - Contracte laboral.docx
@@ -75,43 +75,7 @@
         <w:rPr>
           <w:lang w:val="ca-ES"/>
         </w:rPr>
-        <w:t xml:space="preserve">Amb la finalitat de garantir els seus drets i protegir el tractament de les </w:t>
-      </w:r>
-      <w:r>
-        <w:rPr>
-          <w:lang w:val="ca-ES"/>
-        </w:rPr>
-        <w:t>seves</w:t>
-      </w:r>
-      <w:r>
-        <w:rPr>
-          <w:lang w:val="ca-ES"/>
-        </w:rPr>
-        <w:t xml:space="preserve"> dades personals *NOM EMPRESA* (en endavant, "*EMPRESA*" o "</w:t>
-      </w:r>
-      <w:r>
-        <w:rPr>
-          <w:lang w:val="ca-ES"/>
-        </w:rPr>
-        <w:t>l</w:t>
-      </w:r>
-      <w:r>
-        <w:rPr>
-          <w:lang w:val="ca-ES"/>
-        </w:rPr>
-        <w:t>'</w:t>
-      </w:r>
-      <w:r>
-        <w:rPr>
-          <w:lang w:val="ca-ES"/>
-        </w:rPr>
-        <w:t>e</w:t>
-      </w:r>
-      <w:r>
-        <w:rPr>
-          <w:lang w:val="ca-ES"/>
-        </w:rPr>
-        <w:t>mpresa") li informa que ha implementat un sistema per a la gestió de la protecció de dades personals d'acord amb la legislació vigent.</w:t>
+        <w:t>Amb la finalitat de garantir els seus drets i protegir el tractament de les seves dades personals OptimTech (en endavant, "OptimTech" o "l'empresa") li informa que ha implementat un sistema per a la gestió de la protecció de dades personals d'acord amb la legislació vigent.</w:t>
       </w:r>
     </w:p>
     <w:p>
@@ -155,19 +119,7 @@
         <w:rPr>
           <w:lang w:val="ca-ES"/>
         </w:rPr>
-        <w:t xml:space="preserve">Se l' informa que les seves dades personals seran tractades per l' empresa amb l' única finalitat de dur a terme la gestió laboral, comptable i fiscal del personal i </w:t>
-      </w:r>
-      <w:r>
-        <w:rPr>
-          <w:lang w:val="ca-ES"/>
-        </w:rPr>
-        <w:t>col·laboradors</w:t>
-      </w:r>
-      <w:r>
-        <w:rPr>
-          <w:lang w:val="ca-ES"/>
-        </w:rPr>
-        <w:t xml:space="preserve">, incloent contractes, nòmines i acompliment laboral del personal, així com per assegurar el compliment de les obligacions legals, laborals i contractuals de l' empresa. </w:t>
+        <w:t xml:space="preserve">Se l' informa que les seves dades personals seran tractades per l' empresa amb l' única finalitat de dur a terme la gestió laboral, comptable i fiscal del personal i col·laboradors, incloent contractes, nòmines i acompliment laboral del personal, així com per assegurar el compliment de les obligacions legals, laborals i contractuals de l' empresa. </w:t>
       </w:r>
     </w:p>
     <w:p>
@@ -387,45 +339,33 @@
         <w:rPr>
           <w:lang w:val="ca-ES"/>
         </w:rPr>
-        <w:t xml:space="preserve"> i en </w:t>
-      </w:r>
-      <w:r>
-        <w:rPr>
-          <w:lang w:val="ca-ES"/>
-        </w:rPr>
-        <w:t>l’interès</w:t>
-      </w:r>
-      <w:r>
-        <w:rPr>
-          <w:lang w:val="ca-ES"/>
-        </w:rPr>
-        <w:t xml:space="preserve"> legítim de *EMPRESA* per a gestionar i supervisar el correcte acompliment de les activitats encomanades.</w:t>
-      </w:r>
-    </w:p>
-    <w:p>
-      <w:pPr>
-        <w:rPr>
-          <w:lang w:val="ca-ES"/>
-        </w:rPr>
-      </w:pPr>
-      <w:r>
-        <w:rPr>
-          <w:lang w:val="ca-ES"/>
-        </w:rPr>
-        <w:t xml:space="preserve">Vostè pot exercir els seus drets d'accés, modificació i supressió de les seves dades, així com les d'oposició i limitació del seu tractament. Per a això, pot sol·licitar-ho per correu postal a *ADREÇA* o per correu electrònic a *EMAIL*. </w:t>
-      </w:r>
-    </w:p>
-    <w:p>
-      <w:pPr>
-        <w:rPr>
-          <w:lang w:val="ca-ES"/>
-        </w:rPr>
-      </w:pPr>
-      <w:r>
-        <w:rPr>
-          <w:lang w:val="ca-ES"/>
-        </w:rPr>
-        <w:t xml:space="preserve">Els destinataris de la informació són tots els departaments, divisions, seus i ens associats en els quals s'organitza *EMPRESA*, així com els estaments oficials que per llei exigeixin la cessió. </w:t>
+        <w:t xml:space="preserve"> i en l’interès legítim de OptimTech per a gestionar i supervisar el correcte acompliment de les activitats encomanades.</w:t>
+      </w:r>
+    </w:p>
+    <w:p>
+      <w:pPr>
+        <w:rPr>
+          <w:lang w:val="ca-ES"/>
+        </w:rPr>
+      </w:pPr>
+      <w:r>
+        <w:rPr>
+          <w:lang w:val="ca-ES"/>
+        </w:rPr>
+        <w:t xml:space="preserve">Vostè pot exercir els seus drets d'accés, modificació i supressió de les seves dades, així com les d'oposició i limitació del seu tractament. Per a això, pot sol·licitar-ho per correu postal a OPTIM AI IMPROVEMENT, Polígon industrial Venta Nova, S/N. Carrer l’Aldea, 0, 43894 Camarles, Tarragona o per correu electrònic a dev@optimtech.es. </w:t>
+      </w:r>
+    </w:p>
+    <w:p>
+      <w:pPr>
+        <w:rPr>
+          <w:lang w:val="ca-ES"/>
+        </w:rPr>
+      </w:pPr>
+      <w:r>
+        <w:rPr>
+          <w:lang w:val="ca-ES"/>
+        </w:rPr>
+        <w:t xml:space="preserve">Els destinataris de la informació són tots els departaments, divisions, seus i ens associats en els quals s'organitza OptimTech, així com els estaments oficials que per llei exigeixin la cessió. </w:t>
       </w:r>
     </w:p>
     <w:p>
@@ -492,7 +432,7 @@
         <w:rPr>
           <w:lang w:val="ca-ES"/>
         </w:rPr>
-        <w:t>Altres tercers que presten un servei necessari per a l'adequada gestió i activitat ordinària de *EMPRESA*</w:t>
+        <w:t>Altres tercers que presten un servei necessari per a l'adequada gestió i activitat ordinària de OptimTech</w:t>
       </w:r>
     </w:p>
     <w:p>
@@ -510,19 +450,7 @@
         <w:rPr>
           <w:lang w:val="ca-ES"/>
         </w:rPr>
-        <w:t xml:space="preserve">Clients i proveïdors que ho requereixin per a l' accés o prestar serveis en les seves </w:t>
-      </w:r>
-      <w:r>
-        <w:rPr>
-          <w:lang w:val="ca-ES"/>
-        </w:rPr>
-        <w:t>instal·lacions</w:t>
-      </w:r>
-      <w:r>
-        <w:rPr>
-          <w:lang w:val="ca-ES"/>
-        </w:rPr>
-        <w:t xml:space="preserve">, </w:t>
+        <w:t xml:space="preserve">Clients i proveïdors que ho requereixin per a l' accés o prestar serveis en les seves instal·lacions, </w:t>
       </w:r>
     </w:p>
     <w:p>
@@ -607,57 +535,7 @@
         <w:rPr>
           <w:lang w:val="ca-ES"/>
         </w:rPr>
-        <w:t xml:space="preserve">La prestació d'aquests serveis pot implicar el tractament de les dades personals per part d'empreses ubicades en països fora de l'Espai Econòmic Europeu (transferències internacionals de dades). No obstant això, només es realitzarà amb països que ofereixen un nivell adequat de protecció o que hagin posat a la nostra disposició Clàusules Contractuals Tipus (Standard Contractual </w:t>
-      </w:r>
-      <w:proofErr w:type="spellStart"/>
-      <w:r>
-        <w:rPr>
-          <w:lang w:val="ca-ES"/>
-        </w:rPr>
-        <w:t>Clauses</w:t>
-      </w:r>
-      <w:proofErr w:type="spellEnd"/>
-      <w:r>
-        <w:rPr>
-          <w:lang w:val="ca-ES"/>
-        </w:rPr>
-        <w:t xml:space="preserve"> – SCC) d'acord amb la decisió de la Comissió Europea per a transferències de dades des de responsables a la UE a encarregats establerts fora de la UE.</w:t>
-      </w:r>
-      <w:r>
-        <w:rPr>
-          <w:lang w:val="ca-ES"/>
-        </w:rPr>
-        <w:t xml:space="preserve"> </w:t>
-      </w:r>
-      <w:r>
-        <w:rPr>
-          <w:lang w:val="ca-ES"/>
-        </w:rPr>
-        <w:t>En el cas d'entitats als EUA, garantim que estiguin emparades en el Marc de Privacitat de Dades UE-</w:t>
-      </w:r>
-      <w:r>
-        <w:rPr>
-          <w:lang w:val="ca-ES"/>
-        </w:rPr>
-        <w:t>EUA</w:t>
-      </w:r>
-      <w:r>
-        <w:rPr>
-          <w:lang w:val="ca-ES"/>
-        </w:rPr>
-        <w:t xml:space="preserve">. Decisió (UE) </w:t>
-      </w:r>
-      <w:r>
-        <w:rPr>
-          <w:lang w:val="ca-ES"/>
-        </w:rPr>
-        <w:t>2023/1795</w:t>
-      </w:r>
-      <w:r>
-        <w:rPr>
-          <w:lang w:val="ca-ES"/>
-        </w:rPr>
-        <w:t xml:space="preserve"> de la Comissió, de 10 de juliol de 2023</w:t>
+        <w:t>La prestació d'aquests serveis pot implicar el tractament de les dades personals per part d'empreses ubicades en països fora de l'Espai Econòmic Europeu (transferències internacionals de dades). No obstant això, només es realitzarà amb països que ofereixen un nivell adequat de protecció o que hagin posat a la nostra disposició Clàusules Contractuals Tipus (Standard Contractual Clauses – SCC) d'acord amb la decisió de la Comissió Europea per a transferències de dades des de responsables a la UE a encarregats establerts fora de la UE. En el cas d'entitats als EUA, garantim que estiguin emparades en el Marc de Privacitat de Dades UE-EUA. Decisió (UE) 2023/1795 de la Comissió, de 10 de juliol de 2023</w:t>
       </w:r>
     </w:p>
     <w:p>
@@ -671,19 +549,7 @@
         <w:rPr>
           <w:lang w:val="ca-ES"/>
         </w:rPr>
-        <w:t>Les dades es conservaran durant el temps necessari per a la finalitat per la qual han estat recollides i segons els termes</w:t>
-      </w:r>
-      <w:r>
-        <w:rPr>
-          <w:lang w:val="ca-ES"/>
-        </w:rPr>
-        <w:t xml:space="preserve"> previstos per la legislació laboral i fiscal respecte a la prescripció de responsabilitats</w:t>
-      </w:r>
-      <w:r>
-        <w:rPr>
-          <w:lang w:val="ca-ES"/>
-        </w:rPr>
-        <w:t>.</w:t>
+        <w:t>Les dades es conservaran durant el temps necessari per a la finalitat per la qual han estat recollides i segons els termes previstos per la legislació laboral i fiscal respecte a la prescripció de responsabilitats.</w:t>
       </w:r>
     </w:p>
     <w:p>
@@ -770,45 +636,7 @@
         <w:rPr>
           <w:lang w:val="ca-ES"/>
         </w:rPr>
-        <w:t xml:space="preserve">publicar les </w:t>
-      </w:r>
-      <w:r>
-        <w:rPr>
-          <w:lang w:val="ca-ES"/>
-        </w:rPr>
-        <w:t>seves</w:t>
-      </w:r>
-      <w:r>
-        <w:rPr>
-          <w:lang w:val="ca-ES"/>
-        </w:rPr>
-        <w:t xml:space="preserve"> dades de caràcter </w:t>
-      </w:r>
-      <w:proofErr w:type="spellStart"/>
-      <w:r>
-        <w:rPr>
-          <w:lang w:val="ca-ES"/>
-        </w:rPr>
-        <w:t>identificatiu</w:t>
-      </w:r>
-      <w:proofErr w:type="spellEnd"/>
-      <w:r>
-        <w:rPr>
-          <w:lang w:val="ca-ES"/>
-        </w:rPr>
-        <w:t xml:space="preserve">, incloent la seua imatge, en mitjans audiovisuals, en els canals de comunicació utilitzats per *EMPRESA* per a difondre notícies externes i internes de l'organització, incloent xarxes socials i pàgines web de *EMPRESA*, publicacions i revistes. </w:t>
-      </w:r>
-      <w:r>
-        <w:rPr>
-          <w:lang w:val="ca-ES"/>
-        </w:rPr>
-        <w:t>Aquesta autorització es manté per a totes aquelles publicacions realitzades amb anterioritat a la data de fi de la relació laboral o la retirada d' aquest consentiment</w:t>
-      </w:r>
-      <w:r>
-        <w:rPr>
-          <w:lang w:val="ca-ES"/>
-        </w:rPr>
-        <w:t>.</w:t>
+        <w:t>publicar les seves dades de caràcter identificatiu, incloent la seua imatge, en mitjans audiovisuals, en els canals de comunicació utilitzats per OptimTech per a difondre notícies externes i internes de l'organització, incloent xarxes socials i pàgines web de OptimTech, publicacions i revistes. Aquesta autorització es manté per a totes aquelles publicacions realitzades amb anterioritat a la data de fi de la relació laboral o la retirada d' aquest consentiment.</w:t>
       </w:r>
     </w:p>
     <w:p>
@@ -894,39 +722,27 @@
         <w:rPr>
           <w:lang w:val="ca-ES"/>
         </w:rPr>
-        <w:t xml:space="preserve"> utilitzar la direcció d</w:t>
-      </w:r>
-      <w:r>
-        <w:rPr>
-          <w:lang w:val="ca-ES"/>
-        </w:rPr>
-        <w:t>e correu electrònic</w:t>
-      </w:r>
-      <w:r>
-        <w:rPr>
-          <w:lang w:val="ca-ES"/>
-        </w:rPr>
-        <w:t xml:space="preserve"> personal de la persona treballadora per a l'enviament de les nòmines. En cap cas s' utilitzarà per a un altre propòsit que no sigui el descrit en aquest consentiment. Aquesta autorització serà retirada amb l' extinció de la relació laboral amb l' empresa.</w:t>
-      </w:r>
-    </w:p>
-    <w:p>
-      <w:pPr>
-        <w:rPr>
-          <w:lang w:val="ca-ES"/>
-        </w:rPr>
-      </w:pPr>
-    </w:p>
-    <w:p>
-      <w:pPr>
-        <w:rPr>
-          <w:lang w:val="ca-ES"/>
-        </w:rPr>
-      </w:pPr>
-      <w:r>
-        <w:rPr>
-          <w:lang w:val="ca-ES"/>
-        </w:rPr>
-        <w:t>En qualsevol moment pot oposar-se a aquestes autoritzacions per correu postal a *ADREÇA* o per correu electrònic a *EMAIL*.</w:t>
+        <w:t xml:space="preserve"> utilitzar la direcció de correu electrònic personal de la persona treballadora per a l'enviament de les nòmines. En cap cas s' utilitzarà per a un altre propòsit que no sigui el descrit en aquest consentiment. Aquesta autorització serà retirada amb l' extinció de la relació laboral amb l' empresa.</w:t>
+      </w:r>
+    </w:p>
+    <w:p>
+      <w:pPr>
+        <w:rPr>
+          <w:lang w:val="ca-ES"/>
+        </w:rPr>
+      </w:pPr>
+    </w:p>
+    <w:p>
+      <w:pPr>
+        <w:rPr>
+          <w:lang w:val="ca-ES"/>
+        </w:rPr>
+      </w:pPr>
+      <w:r>
+        <w:rPr>
+          <w:lang w:val="ca-ES"/>
+        </w:rPr>
+        <w:t>En qualsevol moment pot oposar-se a aquestes autoritzacions per correu postal a OPTIM AI IMPROVEMENT, Polígon industrial Venta Nova, S/N. Carrer l’Aldea, 0, 43894 Camarles, Tarragona o per correu electrònic a dev@optimtech.es.</w:t>
       </w:r>
     </w:p>
     <w:p>
@@ -1388,7 +1204,7 @@
           <wp:extent cx="818984" cy="338682"/>
           <wp:effectExtent l="0" t="0" r="635" b="4445"/>
           <wp:wrapNone/>
-          <wp:docPr id="11" name="Imatge 11" descr="Imatge que conté Gràfics, Font, disseny gràfic, logotip&#10;&#10;Pot ser que el contingut generat per IA no sigui correcte.">
+          <wp:docPr id="11" name="Imatge 11" descr="Imatge que conté Gràfics, Font, disseny gràfic, logotip  Pot ser que el contingut generat per IA no sigui correcte.">
             <a:extLst xmlns:a="http://schemas.openxmlformats.org/drawingml/2006/main">
               <a:ext uri="{FF2B5EF4-FFF2-40B4-BE49-F238E27FC236}">
                 <a16:creationId xmlns:a16="http://schemas.microsoft.com/office/drawing/2014/main" id="{1789B5D9-964D-4ECD-8584-185B6DD08C0F}"/>
@@ -1402,7 +1218,7 @@
             <a:graphicData uri="http://schemas.openxmlformats.org/drawingml/2006/picture">
               <pic:pic xmlns:pic="http://schemas.openxmlformats.org/drawingml/2006/picture">
                 <pic:nvPicPr>
-                  <pic:cNvPr id="2" name="Imatge 1" descr="Imatge que conté Gràfics, Font, disseny gràfic, logotip&#10;&#10;Pot ser que el contingut generat per IA no sigui correcte.">
+                  <pic:cNvPr id="2" name="Imatge 1" descr="Imatge que conté Gràfics, Font, disseny gràfic, logotip  Pot ser que el contingut generat per IA no sigui correcte.">
                     <a:extLst>
                       <a:ext uri="{FF2B5EF4-FFF2-40B4-BE49-F238E27FC236}">
                         <a16:creationId xmlns:a16="http://schemas.microsoft.com/office/drawing/2014/main" id="{1789B5D9-964D-4ECD-8584-185B6DD08C0F}"/>

</xml_diff>